<commit_message>
Refresh M044 from live MotherDuck endpoint
Regenerate M044 tables, figures, models, package artifacts, and Word documents from the live canonical MotherDuck extract.
Apply the strict path-proven primary endpoint excluding implausible-date quarantines and preserve imaging-only as secondary/composite.
Add live sync audit artifacts and update tests/validation gates for the refreshed counts.
</commit_message>
<xml_diff>
--- a/M044_ETE_manuscript_v1_0.docx
+++ b/M044_ETE_manuscript_v1_0.docx
@@ -138,7 +138,7 @@
         <w:t xml:space="preserve">recurrence_path_proven</w:t>
       </w:r>
       <w:r>
-        <w:t xml:space="preserve"> from the canonical dual-track recurrence schema), with imaging-only-unconfirmed recurrence and the composite (path-proven or imaging-suspicious) as pre-specified secondary endpoints.</w:t>
+        <w:t xml:space="preserve"> from the canonical dual-track recurrence schema) after excluding implausible-date quarantine rows, with imaging-only-unconfirmed recurrence and the composite (path-proven primary or imaging-only-unconfirmed) as pre-specified secondary endpoints.</w:t>
       </w:r>
     </w:p>
     <w:p>
@@ -153,7 +153,7 @@
         <w:t xml:space="preserve">Results.</w:t>
       </w:r>
       <w:r>
-        <w:t xml:space="preserve"> Among 4,128 patients (median follow-up 1.0 years overall, 3.0 years among 2,728 patients with non-zero follow-up; range 0.0–59.0 years), 2,576 had microscopic ETE, 1,266 had gross ETE, 192 had no/negative ETE, 29 had present-ungraded ETE, and 65 had missing or other ETE. Path-proven recurrence occurred in 59/2,576 microscopic ETE (2.3%), 73/1,266 gross ETE (5.8%), and 12/192 no/negative ETE (6.3%) patients. On a person-year denominator (positive follow-up only), the path-proven incidence rates were 0.71, 1.76, and 1.71 per 100 person-years, respectively. All 1,266 gross ETE patients mapped to T3b under AJCC 8 (100% concordance), whereas microscopic ETE was distributed across T1a, T1b, T2, and T3a, confirming that microscopic ETE does not on its own upstage to T3b. The no/negative ETE subgroup was strongly enriched for lateral-neck nodal disease (37.0% lateral-positive vs 17.1% in gross ETE and 6.3% in microscopic ETE) and for second-surgery ascertainment (10/29 recurred patients had ≥2 surgeries, median first→second-surgery interval 680 days), suggesting that the apparent recurrence signal is driven by clinical-N1b ascertainment and reoperative discovery rather than ETE biology. When lymphatic invasion (</w:t>
+        <w:t xml:space="preserve"> Among 4,128 patients (median follow-up 1.0 years overall, 3.0 years among 2,728 patients with non-zero follow-up; range 0.0–59.0 years), 2,576 had microscopic ETE, 1,266 had gross ETE, 192 had no/negative ETE, 29 had present-ungraded ETE, and 65 had missing or other ETE. Primary path-proven recurrence occurred in 80/2,576 microscopic ETE (3.1%), 105/1,266 gross ETE (8.3%), and 18/192 no/negative ETE (9.4%) patients after excluding 24 implausible-date quarantine rows. On a person-year denominator (positive follow-up only), the primary path-proven incidence rates were 0.96, 2.49, and 2.43 per 100 person-years, respectively. All 1,266 gross ETE patients mapped to T3b under AJCC 8 (100% concordance), whereas microscopic ETE was distributed across T1a, T1b, T2, and T3a, confirming that microscopic ETE does not on its own upstage to T3b. The no/negative ETE subgroup was strongly enriched for lateral-neck nodal disease (57.9% among composite-recurred vs 34.7% among non-recurred no/negative ETE patients) and for second-surgery ascertainment (9/19 composite-recurred patients had ≥2 surgeries, median first→second-surgery interval 909 days), suggesting that the apparent recurrence signal is driven by clinical-N1b ascertainment and reoperative discovery rather than ETE biology. When lymphatic invasion (</w:t>
       </w:r>
       <w:r>
         <w:rPr>
@@ -611,18 +611,18 @@
         <w:t xml:space="preserve">path-proven recurrence</w:t>
       </w:r>
       <w:r>
-        <w:t xml:space="preserve">, defined as biopsy/op-pathology/cytology-positive evidence after the index surgery (FNA Bethesda 5/6 &gt;30 days post-op, structural confirmation in </w:t>
-      </w:r>
-      <w:r>
-        <w:rPr>
-          <w:rFonts w:ascii="Courier New" w:cs="Courier New" w:eastAsia="Courier New" w:hAnsi="Courier New"/>
-          <w:sz w:val="20"/>
-          <w:szCs w:val="20"/>
-        </w:rPr>
-        <w:t xml:space="preserve">recurrence_event_clean_v1</w:t>
-      </w:r>
-      <w:r>
-        <w:t xml:space="preserve">, or LLM-extracted entity with explicit pathology-keyword evidence). Pre-specified secondary outcomes are </w:t>
+        <w:t xml:space="preserve">, defined as </w:t>
+      </w:r>
+      <w:r>
+        <w:rPr>
+          <w:rFonts w:ascii="Courier New" w:cs="Courier New" w:eastAsia="Courier New" w:hAnsi="Courier New"/>
+          <w:sz w:val="20"/>
+          <w:szCs w:val="20"/>
+        </w:rPr>
+        <w:t xml:space="preserve">recurrence_path_proven IS TRUE AND NOT COALESCE(is_implausible_date_quarantine, FALSE)</w:t>
+      </w:r>
+      <w:r>
+        <w:t xml:space="preserve">, excluding 24 raw path-proven rows whose recurrence dates predated first surgery. Pre-specified secondary outcomes are </w:t>
       </w:r>
       <w:r>
         <w:rPr>
@@ -632,7 +632,18 @@
         <w:t xml:space="preserve">imaging-only-unconfirmed recurrence</w:t>
       </w:r>
       <w:r>
-        <w:t xml:space="preserve"> (suspicious imaging without pathologic confirmation) and the </w:t>
+        <w:t xml:space="preserve"> (</w:t>
+      </w:r>
+      <w:r>
+        <w:rPr>
+          <w:rFonts w:ascii="Courier New" w:cs="Courier New" w:eastAsia="Courier New" w:hAnsi="Courier New"/>
+          <w:sz w:val="20"/>
+          <w:szCs w:val="20"/>
+        </w:rPr>
+        <w:t xml:space="preserve">recurrence_status_final='imaging_only_unconfirmed'</w:t>
+      </w:r>
+      <w:r>
+        <w:t xml:space="preserve">) and the </w:t>
       </w:r>
       <w:r>
         <w:rPr>
@@ -642,7 +653,7 @@
         <w:t xml:space="preserve">composite</w:t>
       </w:r>
       <w:r>
-        <w:t xml:space="preserve"> of path-proven or imaging-only events. The legacy </w:t>
+        <w:t xml:space="preserve"> of primary path-proven or imaging-only-unconfirmed events. Imaging suspicion later followed by pathology confirmation is retained as descriptive timing information and is not a separate endpoint. The legacy </w:t>
       </w:r>
       <w:r>
         <w:rPr>
@@ -653,7 +664,18 @@
         <w:t xml:space="preserve">any_recurrence_flag</w:t>
       </w:r>
       <w:r>
-        <w:t xml:space="preserve"> is reported only in sensitivity analyses because of its inconsistency with the canonical resolution (Validation Report §3.2).</w:t>
+        <w:t xml:space="preserve"> is reported only in sensitivity analyses because of its inconsistency with the canonical resolution; headline legacy-vs-canonical discordance on the M044 cohort is tallied in </w:t>
+      </w:r>
+      <w:r>
+        <w:rPr>
+          <w:rFonts w:ascii="Courier New" w:cs="Courier New" w:eastAsia="Courier New" w:hAnsi="Courier New"/>
+          <w:sz w:val="20"/>
+          <w:szCs w:val="20"/>
+        </w:rPr>
+        <w:t xml:space="preserve">manuscript_workspace.m044_legacy_recurrence_flag_audit_v1</w:t>
+      </w:r>
+      <w:r>
+        <w:t xml:space="preserve"> (Validation Report §3.2).</w:t>
       </w:r>
     </w:p>
     <w:p>
@@ -835,15 +857,37 @@
         <w:t xml:space="preserve">without</w:t>
       </w:r>
       <w:r>
-        <w:t xml:space="preserve"> RAI receipt. Pre-specified sensitivity models include the same specification with RAI retained, the full 4,128-patient cohort with historical histology grouping and RAI (supplement), exclusion of zero-follow-up patients, restriction to surgery-date-known patients (1999–2024), use of central- and lateral-LN-positive flags in place of AJCC 8 N stage, ETE × N-stage interaction testing with within-stratum gross-vs-microscopic fits, time-to-event Cox regression on the documented surgery-date subset with and without RAI, and the no/negative-ETE subgroup logistic (Supplement). The full sensitivity panel is enumerated in the analysis plan (M044_ETE_analysis_plan.md §6.4).</w:t>
-      </w:r>
-    </w:p>
-    <w:p>
-      <w:pPr>
-        <w:spacing w:after="120" w:before="0" w:line="360"/>
-      </w:pPr>
-      <w:r>
-        <w:t xml:space="preserve">Missing covariates were retained as explicit categories, never recoded as absent. Six microscopic-ETE rows have unknown tumor size and were excluded from size-stratified analyses. Two patients with surgery dates pre-1999 (earliest 1945-07-13) were retained in the primary cohort and excluded in a sensitivity analysis. Two-sided p-values are reported; α = 0.05. Analyses were performed in Python (statsmodels logistic regression and lifelines Cox PH) driven by reproducible extracts from </w:t>
+        <w:t xml:space="preserve"> RAI receipt. Pre-specified sensitivity models include the same specification with RAI retained, the full 4,128-patient cohort with historical histology grouping and RAI (supplement), exclusion of zero-follow-up patients, restriction to surgery-date-flag subsets (see </w:t>
+      </w:r>
+      <w:r>
+        <w:rPr>
+          <w:rFonts w:ascii="Courier New" w:cs="Courier New" w:eastAsia="Courier New" w:hAnsi="Courier New"/>
+          <w:sz w:val="20"/>
+          <w:szCs w:val="20"/>
+        </w:rPr>
+        <w:t xml:space="preserve">scripts/m044_validate_canonical_v1.sql</w:t>
+      </w:r>
+      <w:r>
+        <w:t xml:space="preserve"> query </w:t>
+      </w:r>
+      <w:r>
+        <w:rPr>
+          <w:rFonts w:ascii="Courier New" w:cs="Courier New" w:eastAsia="Courier New" w:hAnsi="Courier New"/>
+          <w:sz w:val="20"/>
+          <w:szCs w:val="20"/>
+        </w:rPr>
+        <w:t xml:space="preserve">surgery_date_lineage</w:t>
+      </w:r>
+      <w:r>
+        <w:t xml:space="preserve"> for calendar-window counts), use of central- and lateral-LN-positive flags in place of AJCC 8 N stage, ETE × N-stage interaction testing with within-stratum gross-vs-microscopic fits, time-to-event Cox regression on the documented surgery-date subset with and without RAI, and the no/negative-ETE subgroup logistic (Supplement). The full sensitivity panel is enumerated in the analysis plan (M044_ETE_analysis_plan.md §6.4).</w:t>
+      </w:r>
+    </w:p>
+    <w:p>
+      <w:pPr>
+        <w:spacing w:after="120" w:before="0" w:line="360"/>
+      </w:pPr>
+      <w:r>
+        <w:t xml:space="preserve">Missing covariates were retained as explicit categories, never recoded as absent. Six microscopic-ETE rows have unknown tumor size and were excluded from size-stratified analyses. Three patients with surgery dates pre-1999 (earliest 1945-07-13) were retained in the primary cohort and excluded in a sensitivity analysis. Two-sided p-values are reported; α = 0.05. Analyses were performed in Python (statsmodels logistic regression and lifelines Cox PH) driven by reproducible extracts from </w:t>
       </w:r>
       <w:r>
         <w:rPr>
@@ -937,7 +981,127 @@
         <w:spacing w:after="120" w:before="0" w:line="360"/>
       </w:pPr>
       <w:r>
-        <w:t xml:space="preserve">The analytic cohort included 4,128 patients (Table 1). Median age at surgery was 50 years (IQR 38–62); 73.4% were female. Histology was PTC in 3,075 (74.5%), follicular-like in 500 (12.1%), MTC-like in 158 (3.8%), and other in the remainder. Surgery dates were available for 3,212 patients (1999-01-20 to 2024-06-04), with 914 (22.1%) missing surgery date and 2 pre-1999 records.</w:t>
+        <w:t xml:space="preserve">The analytic cohort included 4,128 patients (Table 1). Median age at surgery was 50 years (IQR 38–62); 73.4% were female. Histology was PTC in 3,075 (74.5%), follicular-like in 500 (12.1%), MTC-like in 158 (3.8%), and other in the remainder. Surgery-anchor dates derive from </w:t>
+      </w:r>
+      <w:r>
+        <w:rPr>
+          <w:b/>
+          <w:bCs/>
+        </w:rPr>
+        <w:t xml:space="preserve">`canonical_patient_master.surg_first_date`</w:t>
+      </w:r>
+      <w:r>
+        <w:t xml:space="preserve"> (operative-spine lineage; mig_258 cohort flags include </w:t>
+      </w:r>
+      <w:r>
+        <w:rPr>
+          <w:rFonts w:ascii="Courier New" w:cs="Courier New" w:eastAsia="Courier New" w:hAnsi="Courier New"/>
+          <w:sz w:val="20"/>
+          <w:szCs w:val="20"/>
+        </w:rPr>
+        <w:t xml:space="preserve">surg_date_missing</w:t>
+      </w:r>
+      <w:r>
+        <w:t xml:space="preserve">). In this extract (n=4128), </w:t>
+      </w:r>
+      <w:r>
+        <w:rPr>
+          <w:b/>
+          <w:bCs/>
+        </w:rPr>
+        <w:t xml:space="preserve">missing surgery-date indicator</w:t>
+      </w:r>
+      <w:r>
+        <w:t xml:space="preserve"> applied to </w:t>
+      </w:r>
+      <w:r>
+        <w:rPr>
+          <w:b/>
+          <w:bCs/>
+        </w:rPr>
+        <w:t xml:space="preserve">0</w:t>
+      </w:r>
+      <w:r>
+        <w:t xml:space="preserve"> patients (</w:t>
+      </w:r>
+      <w:r>
+        <w:rPr>
+          <w:b/>
+          <w:bCs/>
+        </w:rPr>
+        <w:t xml:space="preserve">0.0%</w:t>
+      </w:r>
+      <w:r>
+        <w:t xml:space="preserve">). Lineage SSOT notes (cohort extract): main.canonical_patient_master.surg_first_date; mig_254 backfill surg_first=NULL from first_surgery_date_v2.</w:t>
+      </w:r>
+    </w:p>
+    <w:p>
+      <w:pPr>
+        <w:spacing w:after="120" w:before="0" w:line="360"/>
+      </w:pPr>
+      <w:r>
+        <w:t xml:space="preserve">Calendar partition among lineage flags counts (non-exclusive windows per flag): before 1999-01-01: </w:t>
+      </w:r>
+      <w:r>
+        <w:rPr>
+          <w:b/>
+          <w:bCs/>
+        </w:rPr>
+        <w:t xml:space="preserve">3</w:t>
+      </w:r>
+      <w:r>
+        <w:t xml:space="preserve">; 1999-01-01 through 2024-12-31: </w:t>
+      </w:r>
+      <w:r>
+        <w:rPr>
+          <w:b/>
+          <w:bCs/>
+        </w:rPr>
+        <w:t xml:space="preserve">4090</w:t>
+      </w:r>
+      <w:r>
+        <w:t xml:space="preserve">; after 2024-12-31: </w:t>
+      </w:r>
+      <w:r>
+        <w:rPr>
+          <w:b/>
+          <w:bCs/>
+        </w:rPr>
+        <w:t xml:space="preserve">35</w:t>
+      </w:r>
+      <w:r>
+        <w:t xml:space="preserve">. Among patients with calendar surgery dates (4128/4128), first-surgery spans 1945-07-13–2025-08-01. For Cox PH and Kaplan–Meier path-proven time-to-event, only patients with documented surgery dates, strictly positive analytic follow-up, complete age and tumor size, and positive finite durations are retained — see </w:t>
+      </w:r>
+      <w:r>
+        <w:rPr>
+          <w:b/>
+          <w:bCs/>
+        </w:rPr>
+        <w:t xml:space="preserve">`data/m044/m044_inclusion_flow_qc.csv`</w:t>
+      </w:r>
+      <w:r>
+        <w:t xml:space="preserve"> (latest </w:t>
+      </w:r>
+      <w:r>
+        <w:rPr>
+          <w:rFonts w:ascii="Courier New" w:cs="Courier New" w:eastAsia="Courier New" w:hAnsi="Courier New"/>
+          <w:sz w:val="20"/>
+          <w:szCs w:val="20"/>
+        </w:rPr>
+        <w:t xml:space="preserve">scripts/m044_ete_fit_models.py</w:t>
+      </w:r>
+      <w:r>
+        <w:t xml:space="preserve"> run) and validation </w:t>
+      </w:r>
+      <w:r>
+        <w:rPr>
+          <w:b/>
+          <w:bCs/>
+        </w:rPr>
+        <w:t xml:space="preserve">`studies/m044_validation/m044_canonical_audit.md`</w:t>
+      </w:r>
+      <w:r>
+        <w:t xml:space="preserve">.</w:t>
       </w:r>
     </w:p>
     <w:p>
@@ -1030,23 +1194,23 @@
         <w:spacing w:after="120" w:before="0" w:line="360"/>
       </w:pPr>
       <w:r>
-        <w:t xml:space="preserve">Path-proven recurrence occurred in 59/2,576 (2.3%) microscopic ETE, 73/1,266 (5.8%) gross ETE, and 12/192 (6.3%) no/negative ETE patients (Table 2). Imaging-only-unconfirmed recurrence rates were 3.3%, 7.1%, and 8.9%, respectively, and composite recurrence rates were 5.6%, 12.9%, and 15.1% (Table 2). Imaging-suspicion-then-pathologic-confirmation accounted for 11, 17, and 5 patients in the three groups, respectively, and is included in the path-proven count by definition.</w:t>
-      </w:r>
-    </w:p>
-    <w:p>
-      <w:pPr>
-        <w:spacing w:after="120" w:before="0" w:line="360"/>
-      </w:pPr>
-      <w:r>
-        <w:t xml:space="preserve">On the positive-follow-up person-year denominator, path-proven recurrence rates were 0.71, 1.76, and 1.71 per 100 person-years for microscopic, gross, and no/negative ETE respectively (Table 2). Composite-event person-year rates were 1.74, 3.92, and 4.00.</w:t>
-      </w:r>
-    </w:p>
-    <w:p>
-      <w:pPr>
-        <w:spacing w:after="120" w:before="0" w:line="360"/>
-      </w:pPr>
-      <w:r>
-        <w:t xml:space="preserve">Within the strict-DTC three-group analytic subset (Methods), the crude path-proven odds ratio for gross ETE vs microscopic ETE was 2.60 (95% CI 1.82–3.70); the crude odds ratio for no/negative ETE vs microscopic ETE was 2.82 (95% CI 1.45–5.48). The legacy </w:t>
+        <w:t xml:space="preserve">Primary path-proven recurrence occurred in 80/2,576 (3.1%) microscopic ETE, 105/1,266 (8.3%) gross ETE, and 18/192 (9.4%) no/negative ETE patients after excluding implausible-date quarantine rows (Table 2). Imaging-only-unconfirmed recurrence rates were 0.5%, 0.6%, and 0.5%, respectively, and composite recurrence rates were 3.6%, 8.9%, and 9.9% (Table 2). Imaging-suspicion-then-pathologic-confirmation accounted for 2, 3, and 2 patients in the three groups, respectively, and is reported descriptively rather than as a separate endpoint.</w:t>
+      </w:r>
+    </w:p>
+    <w:p>
+      <w:pPr>
+        <w:spacing w:after="120" w:before="0" w:line="360"/>
+      </w:pPr>
+      <w:r>
+        <w:t xml:space="preserve">On the positive-follow-up person-year denominator, primary path-proven recurrence rates were 0.96, 2.49, and 2.43 per 100 person-years for microscopic, gross, and no/negative ETE respectively (Table 2). Composite-event person-year rates were 1.09, 2.68, and 2.57.</w:t>
+      </w:r>
+    </w:p>
+    <w:p>
+      <w:pPr>
+        <w:spacing w:after="120" w:before="0" w:line="360"/>
+      </w:pPr>
+      <w:r>
+        <w:t xml:space="preserve">Within the strict-DTC three-group analytic subset (Methods), the crude path-proven odds ratio for gross ETE vs microscopic ETE was 2.79 (95% CI 2.05–3.79); the crude odds ratio for no/negative ETE vs microscopic ETE was 3.37 (95% CI 1.94–5.84). The legacy </w:t>
       </w:r>
       <w:r>
         <w:rPr>
@@ -1057,7 +1221,39 @@
         <w:t xml:space="preserve">any_recurrence_flag</w:t>
       </w:r>
       <w:r>
-        <w:t xml:space="preserve"> produced 503 events, of which 318 had no canonical evidence in the recurrence-resolved table and were therefore considered uncoded; the legacy variable is reported only in sensitivity (Supplement Table S2).</w:t>
+        <w:t xml:space="preserve"> is discordant with </w:t>
+      </w:r>
+      <w:r>
+        <w:rPr>
+          <w:rFonts w:ascii="Courier New" w:cs="Courier New" w:eastAsia="Courier New" w:hAnsi="Courier New"/>
+          <w:sz w:val="20"/>
+          <w:szCs w:val="20"/>
+        </w:rPr>
+        <w:t xml:space="preserve">main.canonical_recurrence_resolved_v1</w:t>
+      </w:r>
+      <w:r>
+        <w:t xml:space="preserve"> for a material subset of the cohort (</w:t>
+      </w:r>
+      <w:r>
+        <w:rPr>
+          <w:b/>
+          <w:bCs/>
+        </w:rPr>
+        <w:t xml:space="preserve">live counts:</w:t>
+      </w:r>
+      <w:r>
+        <w:t xml:space="preserve"> </w:t>
+      </w:r>
+      <w:r>
+        <w:rPr>
+          <w:rFonts w:ascii="Courier New" w:cs="Courier New" w:eastAsia="Courier New" w:hAnsi="Courier New"/>
+          <w:sz w:val="20"/>
+          <w:szCs w:val="20"/>
+        </w:rPr>
+        <w:t xml:space="preserve">SELECT * FROM manuscript_workspace.m044_legacy_recurrence_flag_audit_v1</w:t>
+      </w:r>
+      <w:r>
+        <w:t xml:space="preserve">); it is reported only in sensitivity (Supplement Table S2), never as a primary endpoint.</w:t>
       </w:r>
     </w:p>
     <w:p>
@@ -1120,15 +1316,15 @@
         <w:spacing w:after="120" w:before="0" w:line="360"/>
       </w:pPr>
       <w:r>
-        <w:t xml:space="preserve">Gross vs microscopic ETE: adjusted OR 1.80 (95% CI 1.22–2.67; p=0.003324)</w:t>
-      </w:r>
-    </w:p>
-    <w:p>
-      <w:pPr>
-        <w:spacing w:after="120" w:before="0" w:line="360"/>
-      </w:pPr>
-      <w:r>
-        <w:t xml:space="preserve">No/negative vs microscopic ETE: adjusted OR 0.52 (95% CI 0.22–1.23; p=0.1358)</w:t>
+        <w:t xml:space="preserve">Gross vs microscopic ETE: adjusted OR 2.08 (95% CI 1.48–2.91; p=2.458e-05)</w:t>
+      </w:r>
+    </w:p>
+    <w:p>
+      <w:pPr>
+        <w:spacing w:after="120" w:before="0" w:line="360"/>
+      </w:pPr>
+      <w:r>
+        <w:t xml:space="preserve">No/negative vs microscopic ETE: adjusted OR 0.67 (95% CI 0.32–1.40; p=0.2842)</w:t>
       </w:r>
     </w:p>
     <w:p>
@@ -1148,23 +1344,23 @@
         <w:spacing w:after="120" w:before="0" w:line="360"/>
       </w:pPr>
       <w:r>
-        <w:t xml:space="preserve">Strict cohort — gross vs microscopic ETE (RAI covariate retained): adjusted OR 1.40 (95% CI 0.93–2.10; p=0.1052)</w:t>
-      </w:r>
-    </w:p>
-    <w:p>
-      <w:pPr>
-        <w:spacing w:after="120" w:before="0" w:line="360"/>
-      </w:pPr>
-      <w:r>
-        <w:t xml:space="preserve">Strict cohort — no/negative vs microscopic ETE (RAI covariate retained): adjusted OR 0.52 (95% CI 0.22–1.25; p=0.1469)</w:t>
-      </w:r>
-    </w:p>
-    <w:p>
-      <w:pPr>
-        <w:spacing w:after="120" w:before="0" w:line="360"/>
-      </w:pPr>
-      <w:r>
-        <w:t xml:space="preserve">(McFadden pseudo-R²=0.1370; n=3750, path-proven events=139; likelihood-ratio χ²=162.91 vs intercept-only). A Cox proportional hazards model on the same strict-DTC subset (documented surgery date, positive follow-up; </w:t>
+        <w:t xml:space="preserve">Strict cohort — gross vs microscopic ETE (RAI covariate retained): adjusted OR 1.59 (95% CI 1.12–2.26; p=0.009911)</w:t>
+      </w:r>
+    </w:p>
+    <w:p>
+      <w:pPr>
+        <w:spacing w:after="120" w:before="0" w:line="360"/>
+      </w:pPr>
+      <w:r>
+        <w:t xml:space="preserve">Strict cohort — no/negative vs microscopic ETE (RAI covariate retained): adjusted OR 0.66 (95% CI 0.31–1.41; p=0.2849)</w:t>
+      </w:r>
+    </w:p>
+    <w:p>
+      <w:pPr>
+        <w:spacing w:after="120" w:before="0" w:line="360"/>
+      </w:pPr>
+      <w:r>
+        <w:t xml:space="preserve">(McFadden pseudo-R²=0.1404; n=3750, path-proven events=193; likelihood-ratio χ²=213.65 vs intercept-only). A Cox proportional hazards model on the same strict-DTC subset (documented surgery date, positive follow-up; </w:t>
       </w:r>
       <w:r>
         <w:rPr>
@@ -1174,7 +1370,7 @@
         <w:t xml:space="preserve">no RAI covariate</w:t>
       </w:r>
       <w:r>
-        <w:t xml:space="preserve">; n=2018) estimated HR=2.34 (95% CI 1.35–4.06; p=0.002591) for gross vs microscopic ETE.</w:t>
+        <w:t xml:space="preserve">; n=2511) estimated HR=0.91 (95% CI 0.48–1.73; p=0.7741) for gross vs microscopic ETE.</w:t>
       </w:r>
     </w:p>
     <w:p>
@@ -1192,7 +1388,7 @@
         <w:t xml:space="preserve">ETE × AJCC8 N-stage interaction</w:t>
       </w:r>
       <w:r>
-        <w:t xml:space="preserve"> (likelihood ratio vs main-effects-only model): LR χ²=6.30, df=6, p=0.3909. The omnibus interaction test did not reach α=0.05; stratum-specific contrasts are nevertheless presented given clinically heterogeneous crude gradients (especially within N1b).</w:t>
+        <w:t xml:space="preserve"> (likelihood ratio vs main-effects-only model): LR χ²=3.70, df=6, p=0.7177. The omnibus interaction test did not reach α=0.05; stratum-specific contrasts are nevertheless presented given clinically heterogeneous crude gradients (especially within N1b).</w:t>
       </w:r>
     </w:p>
     <w:p>
@@ -1226,7 +1422,7 @@
         <w:t xml:space="preserve">N0:</w:t>
       </w:r>
       <w:r>
-        <w:t xml:space="preserve"> adjusted OR 1.65 (95% CI 0.72–3.75; p=0.2351); n=1115, path-proven events=29.</w:t>
+        <w:t xml:space="preserve"> adjusted OR 1.74 (95% CI 0.85–3.55; p=0.1278); n=1115, path-proven events=39.</w:t>
       </w:r>
     </w:p>
     <w:p>
@@ -1245,7 +1441,7 @@
         <w:t xml:space="preserve">N1a:</w:t>
       </w:r>
       <w:r>
-        <w:t xml:space="preserve"> adjusted OR 1.95 (95% CI 1.21–3.15; p=0.006118); n=2372, path-proven events=92.</w:t>
+        <w:t xml:space="preserve"> adjusted OR 2.17 (95% CI 1.44–3.27; p=0.0002266); n=2372, path-proven events=128.</w:t>
       </w:r>
     </w:p>
     <w:p>
@@ -1264,7 +1460,7 @@
         <w:t xml:space="preserve">N1b:</w:t>
       </w:r>
       <w:r>
-        <w:t xml:space="preserve"> adjusted OR 1.24 (95% CI 0.07–21.38; p=0.8817); n=76, path-proven events=16.</w:t>
+        <w:t xml:space="preserve"> adjusted OR 3.78 (95% CI 0.59–24.32; p=0.162); n=76, path-proven events=23.</w:t>
       </w:r>
     </w:p>
     <w:p>
@@ -1318,7 +1514,7 @@
         <w:spacing w:after="120" w:before="0" w:line="360"/>
       </w:pPr>
       <w:r>
-        <w:t xml:space="preserve">In the pre-specified pooled lymphovascular sensitivity model (missing treated as absent for the pooled binary), the pooled coefficient had adjusted OR=1.80 (p=0.004005). Instead, this pooled construction produced a statistically significant </w:t>
+        <w:t xml:space="preserve">In the pre-specified pooled lymphovascular sensitivity model (missing treated as absent for the pooled binary), the pooled coefficient had adjusted OR=1.72 (p=0.001948). Instead, this pooled construction produced a statistically significant </w:t>
       </w:r>
       <w:r>
         <w:rPr>
@@ -1392,7 +1588,7 @@
         <w:spacing w:after="120" w:before="0" w:line="360"/>
       </w:pPr>
       <w:r>
-        <w:t xml:space="preserve">Microscopic ETE recurrence climbed with tumor size to 5.6% in the &gt;4 cm bin, paralleling published reports that mETE prognostic effect strengthens in larger tumors.[2, 13]</w:t>
+        <w:t xml:space="preserve">Microscopic ETE recurrence climbed with tumor size to 6.7% in the &gt;4 cm bin, paralleling published reports that mETE prognostic effect strengthens in larger tumors.[2, 13]</w:t>
       </w:r>
     </w:p>
     <w:p>
@@ -1415,7 +1611,7 @@
         <w:spacing w:after="120" w:before="0" w:line="360"/>
       </w:pPr>
       <w:r>
-        <w:t xml:space="preserve">Among the 192 no/negative ETE patients, 29 (15.1%) had a composite recurrence event (Table 4). Compared to non-recurred no/negative ETE patients, recurred patients had similar mean tumor size (3.61 vs 3.24 cm, p = NS), markedly longer median follow-up (2.53 vs 0.12 years), more central- and lateral-LN positivity (10/29 vs 31/163 central, 19/29 vs 52/163 lateral), and were far more likely to have undergone at least two surgeries (10/29 = 34.5% vs 24/163 = 14.7%) with a much longer median interval between first and second surgery (680 vs 148 days). Twelve of 29 recurrences in this group were path-proven and 5 were imaging-suspicion-then-path-confirmed. Among recurred patients with completion-thyroidectomy data, the most common completion category was "missing" (n=20), with the rest distributed across "pathology_upgrade" and "unclassified" reasons.</w:t>
+        <w:t xml:space="preserve">Among the 192 no/negative ETE patients, 19 (9.9%) had a composite recurrence event (Table 4). Compared to non-recurred no/negative ETE patients, recurred patients had similar median tumor size (1.8 vs 2.1 cm), more central- and lateral-LN positivity (7/19 vs 34/173 central; 11/19 vs 60/173 lateral), and were far more likely to have undergone at least two surgeries (9/19 = 47.4% vs 25/173 = 14.5%) with a much longer median interval between first and second surgery (909 vs 135 days). Eighteen of 19 composite events in this group were primary path-proven and 1 was imaging-only-unconfirmed.</w:t>
       </w:r>
     </w:p>
     <w:p>
@@ -1491,7 +1687,48 @@
         <w:spacing w:after="120" w:before="0" w:line="360"/>
       </w:pPr>
       <w:r>
-        <w:t xml:space="preserve">Excluding the 1,400 zero-follow-up patients did not materially change ETE-group rate estimates, although it shifted denominators downward (Supplement Table S3). Restricting to surgery-date-known patients (1999–2024, n=3,212) preserved the gross-vs-microscopic ETE contrast (Supplement Table S4). Replacing AJCC 8 N stage with central- and lateral-LN-positive flags did not change the qualitative direction of the gross-ETE effect (Supplement Table S5). The legacy </w:t>
+        <w:t xml:space="preserve">Excluding the 1,400 zero-follow-up patients did not materially change ETE-group rate estimates, although it shifted denominators downward (Supplement Table S3). The pre-specified </w:t>
+      </w:r>
+      <w:r>
+        <w:rPr>
+          <w:b/>
+          <w:bCs/>
+        </w:rPr>
+        <w:t xml:space="preserve">logistic sensitivity</w:t>
+      </w:r>
+      <w:r>
+        <w:t xml:space="preserve"> restricting to </w:t>
+      </w:r>
+      <w:r>
+        <w:rPr>
+          <w:b/>
+          <w:bCs/>
+        </w:rPr>
+        <w:t xml:space="preserve">`surg_date_1999_2024`</w:t>
+      </w:r>
+      <w:r>
+        <w:t xml:space="preserve"> (calendar-flag subset; Supplement Table </w:t>
+      </w:r>
+      <w:r>
+        <w:rPr>
+          <w:rFonts w:ascii="Courier New" w:cs="Courier New" w:eastAsia="Courier New" w:hAnsi="Courier New"/>
+          <w:sz w:val="20"/>
+          <w:szCs w:val="20"/>
+        </w:rPr>
+        <w:t xml:space="preserve">S2_surgery_date_1999_2024</w:t>
+      </w:r>
+      <w:r>
+        <w:t xml:space="preserve">) should be interpreted alongside </w:t>
+      </w:r>
+      <w:r>
+        <w:rPr>
+          <w:b/>
+          <w:bCs/>
+        </w:rPr>
+        <w:t xml:space="preserve">`scripts/m044_validate_canonical_v1_runner.py`</w:t>
+      </w:r>
+      <w:r>
+        <w:t xml:space="preserve"> lineage metrics — the live extract contains 4,090 cohort rows with surgery dates in 1999–2024 and 3,717 strict-DTC three-level model-complete rows in that window. Replacing AJCC 8 N stage with central- and lateral-LN-positive flags did not change the qualitative direction of the gross-ETE effect (Supplement Table S5). The legacy </w:t>
       </w:r>
       <w:r>
         <w:rPr>
@@ -1502,7 +1739,18 @@
         <w:t xml:space="preserve">any_recurrence_flag</w:t>
       </w:r>
       <w:r>
-        <w:t xml:space="preserve"> model produced inflated event counts (n=503) and a smaller relative gross-vs-microscopic-ETE effect, consistent with legacy-flag noise rather than a different biologic signal. The pooled lymphovascular binary sensitivity (combining lymphatic and vascular positivity with missing treated as absent) produced statistically significant elevated odds—not a protective signal (see Results, multivariable block)—making it an inadequate reconstruction of inverse-risk pooled-LVI artifacts emphasized in prior reports.</w:t>
+        <w:t xml:space="preserve"> sensitivity model produced inflated event totals relative to primary path-proven recurrence and a smaller relative gross-vs-microscopic-ETE effect, consistent with legacy-flag noise rather than a different biologic signal (audit: </w:t>
+      </w:r>
+      <w:r>
+        <w:rPr>
+          <w:rFonts w:ascii="Courier New" w:cs="Courier New" w:eastAsia="Courier New" w:hAnsi="Courier New"/>
+          <w:sz w:val="20"/>
+          <w:szCs w:val="20"/>
+        </w:rPr>
+        <w:t xml:space="preserve">manuscript_workspace.m044_legacy_recurrence_flag_audit_v1</w:t>
+      </w:r>
+      <w:r>
+        <w:t xml:space="preserve">). The pooled lymphovascular binary sensitivity (combining lymphatic and vascular positivity with missing treated as absent) produced statistically significant elevated odds—not a protective signal (see Results, multivariable block)—making it an inadequate reconstruction of inverse-risk pooled-LVI artifacts emphasized in prior reports.</w:t>
       </w:r>
     </w:p>
     <w:p>
@@ -1565,7 +1813,28 @@
         <w:t xml:space="preserve">strict-DTC primary model without an RAI covariate</w:t>
       </w:r>
       <w:r>
-        <w:t xml:space="preserve">, the gross-vs-microscopic association moves toward the crude gradient (Gross vs microscopic ETE: adjusted OR 1.80 (95% CI 1.22–2.67; p=0.003324)), while Cox regression on documented surgery-interval follow-up without RAI retained elevated hazard for gross vs microscopic disease (HR=2.34, 95% CI 1.35–4.06; p=0.002591). Together, these findings indicate that much of the earlier logistic attenuation was driven by </w:t>
+        <w:t xml:space="preserve">, the gross-vs-microscopic association moves toward the crude gradient (Gross vs microscopic ETE: adjusted OR 2.08 (95% CI 1.48–2.91; p=2.458e-05)), while Cox regression on documented surgery-interval follow-up without RAI yielded HR 0.91 (95% CI 0.48–1.73; p=0.7741) for gross versus microscopic ETE — </w:t>
+      </w:r>
+      <w:r>
+        <w:rPr>
+          <w:b/>
+          <w:bCs/>
+        </w:rPr>
+        <w:t xml:space="preserve">no statistically significant incremental hazard</w:t>
+      </w:r>
+      <w:r>
+        <w:t xml:space="preserve"> on the Cox time axis aligned to path-proven TTE (</w:t>
+      </w:r>
+      <w:r>
+        <w:rPr>
+          <w:rFonts w:ascii="Courier New" w:cs="Courier New" w:eastAsia="Courier New" w:hAnsi="Courier New"/>
+          <w:sz w:val="20"/>
+          <w:szCs w:val="20"/>
+        </w:rPr>
+        <w:t xml:space="preserve">data/m044/m044_inclusion_flow_qc.csv</w:t>
+      </w:r>
+      <w:r>
+        <w:t xml:space="preserve">). Together, these findings indicate that much of the earlier logistic attenuation was driven by </w:t>
       </w:r>
       <w:r>
         <w:rPr>
@@ -1585,15 +1854,15 @@
         <w:t xml:space="preserve">histologic heterogeneity</w:t>
       </w:r>
       <w:r>
-        <w:t xml:space="preserve">, not by disappearance of a true gross-ETE signal. Microscopic ETE behaved more like the no-ETE group than gross ETE on most ETE-anchored contrasts. These findings support the AJCC 8th edition decision not to upstage microscopic ETE to T3b and reinforce the principle that gross strap-muscle invasion is a meaningfully different pathologic phenomenon, despite recent literature questioning whether T3b adds incremental risk over T2 in small tumors.[24, 47, 51]</w:t>
-      </w:r>
-    </w:p>
-    <w:p>
-      <w:pPr>
-        <w:spacing w:after="120" w:before="0" w:line="360"/>
-      </w:pPr>
-      <w:r>
-        <w:t xml:space="preserve">Three findings warrant emphasis. First, the disconnect between the analytic cohort’s </w:t>
+        <w:t xml:space="preserve">, not by disappearance of the gross-vs-microscopic OR gradient in the primary logistic frame. Microscopic ETE behaved more like the no-ETE group than gross ETE on most ETE-anchored contrasts. These findings support the AJCC 8th edition decision not to upstage microscopic ETE to T3b and reinforce the principle that gross strap-muscle invasion is a meaningfully different pathologic phenomenon, despite recent literature questioning whether T3b adds incremental risk over T2 in small tumors.[24, 47, 51]</w:t>
+      </w:r>
+    </w:p>
+    <w:p>
+      <w:pPr>
+        <w:spacing w:after="120" w:before="0" w:line="360"/>
+      </w:pPr>
+      <w:r>
+        <w:t xml:space="preserve">Three findings warrant emphasis. First, the disconnect between the analytic cohort’s legacy </w:t>
       </w:r>
       <w:r>
         <w:rPr>
@@ -1604,15 +1873,37 @@
         <w:t xml:space="preserve">any_recurrence_flag</w:t>
       </w:r>
       <w:r>
-        <w:t xml:space="preserve"> (n=503) and the canonical dual-track recurrence schema (path-proven n=145; imaging-only n=195) reinforces a methodologic principle that has been understated in the prior thyroid-cancer literature: pathologically-confirmed recurrence is a distinct endpoint from imaging-suspicion, and the two should not be collapsed when the surveillance intensity differs between exposure groups. In our cohort, the microscopic-ETE group has shorter median follow-up (0.66 years vs 1.94 for gross ETE), reflecting a younger calendar-time sampling, and the cohort-flag noise was greatest in this group.</w:t>
-      </w:r>
-    </w:p>
-    <w:p>
-      <w:pPr>
-        <w:spacing w:after="120" w:before="0" w:line="360"/>
-      </w:pPr>
-      <w:r>
-        <w:t xml:space="preserve">Second, the no/negative ETE group is best understood as a high-nodal-burden, high-reoperation-rate subset that is enriched for clinically apparent lateral-neck disease at presentation. Its 6.3% path-proven recurrence rate is driven by tumor size, lateral-compartment node positivity, and second-surgery ascertainment. Treating this group as evidence that "no ETE" patients can have higher recurrence than microscopic ETE patients would invert the underlying clinical reality, which is that this group entered the cohort through a fundamentally different clinical pathway. Future work should re-anchor the no-ETE group to a propensity-matched comparator on tumor size, N stage, and surgical complexity.</w:t>
+        <w:t xml:space="preserve"> and the canonical dual-track recurrence schema (primary path-proven n=204; imaging-only n=24 in this cohort; see </w:t>
+      </w:r>
+      <w:r>
+        <w:rPr>
+          <w:rFonts w:ascii="Courier New" w:cs="Courier New" w:eastAsia="Courier New" w:hAnsi="Courier New"/>
+          <w:sz w:val="20"/>
+          <w:szCs w:val="20"/>
+        </w:rPr>
+        <w:t xml:space="preserve">main.canonical_recurrence_resolved_v1</w:t>
+      </w:r>
+      <w:r>
+        <w:t xml:space="preserve"> and </w:t>
+      </w:r>
+      <w:r>
+        <w:rPr>
+          <w:rFonts w:ascii="Courier New" w:cs="Courier New" w:eastAsia="Courier New" w:hAnsi="Courier New"/>
+          <w:sz w:val="20"/>
+          <w:szCs w:val="20"/>
+        </w:rPr>
+        <w:t xml:space="preserve">manuscript_workspace.m044_legacy_recurrence_flag_audit_v1</w:t>
+      </w:r>
+      <w:r>
+        <w:t xml:space="preserve">) reinforces a methodologic principle that has been understated in the prior thyroid-cancer literature: pathologically-confirmed recurrence is a distinct endpoint from imaging-suspicion, and the two should not be collapsed when the surveillance intensity differs between exposure groups. In addition, 24 raw path-proven rows were excluded from the primary endpoint because their recurrence dates predated first surgery and were explicitly quarantined. In our cohort, the microscopic-ETE group has shorter median follow-up (0.66 years vs 1.94 for gross ETE), reflecting a younger calendar-time sampling, and the cohort-flag noise was greatest in this group.</w:t>
+      </w:r>
+    </w:p>
+    <w:p>
+      <w:pPr>
+        <w:spacing w:after="120" w:before="0" w:line="360"/>
+      </w:pPr>
+      <w:r>
+        <w:t xml:space="preserve">Second, the no/negative ETE group is best understood as a high-nodal-burden, high-reoperation-rate subset that is enriched for clinically apparent lateral-neck disease at presentation. Its 9.4% primary path-proven recurrence rate is driven by tumor size, lateral-compartment node positivity, and second-surgery ascertainment. Treating this group as evidence that "no ETE" patients can have higher recurrence than microscopic ETE patients would invert the underlying clinical reality, which is that this group entered the cohort through a fundamentally different clinical pathway. Future work should re-anchor the no-ETE group to a propensity-matched comparator on tumor size, N stage, and surgical complexity.</w:t>
       </w:r>
     </w:p>
     <w:p>
@@ -1628,23 +1919,78 @@
         <w:spacing w:after="120" w:before="0" w:line="360"/>
       </w:pPr>
       <w:r>
-        <w:t xml:space="preserve">Comparison with prior literature. Our findings align with the systematic review of 80 studies (Elicit, 2026) summary that mETE’s prognostic value is context-dependent, and with the size-stratified findings of Chae A Kim and colleagues (2025), who reported recurrent/persistent disease rates of 2.6% (≤1 cm), 5.6% (1.1–2 cm), 16.7% (2.1–4 cm), and 8.2% (&gt;4 cm) in mETE patients[13]. Our cohort shows a similar size-dependent gradient for microscopic ETE path-proven recurrence (1.1%, 2.7%, 2.3%, 5.6% across the same bins), although the absolute rates are lower, consistent with our pathology-proven endpoint definition. The finding that all 1,266 gross ETE patients map to T3b under AJCC 8 reproduces the mechanism by which the AJCC 8 change drives substantial downstaging in cohorts with abundant microscopic ETE, as previously reported by Parvathareddy and colleagues (58.8% downstaging of T3 patients) and by Tran and colleagues (70.5% downstaging in a 577-patient cohort).[1, 2]</w:t>
-      </w:r>
-    </w:p>
-    <w:p>
-      <w:pPr>
-        <w:spacing w:after="120" w:before="0" w:line="360"/>
-      </w:pPr>
-      <w:r>
-        <w:t xml:space="preserve">Limitations. This is a retrospective single-institution cohort with substantial follow-up censoring (33.9% of patients have zero follow-up), 22.1% missing surgery dates, and free-text data-quality variability in the lymphatic-invasion field. The path-proven recurrence endpoint depends on completeness of pathology and operative-event capture; under-ascertainment is plausible particularly for patients whose recurrence was managed at outside institutions. The structural-recurrence flag in the cohort view (n=1,819) is inconsistent with the canonical dual-track resolution and was not used as a primary endpoint; its high apparent rate is an artifact and should not be over-interpreted. Multivariable adjustment cannot fully account for the systematic differences between the no/negative ETE subgroup and the rest of the cohort, and we therefore present that subgroup descriptively rather than as a direct biologic comparator. Our cohort spans 1999–2024 among patients with non-missing dates, encompassing two distinct AJCC eras and a large change in surveillance intensity; era-stratified sensitivity analyses are reported in the supplement.</w:t>
-      </w:r>
-    </w:p>
-    <w:p>
-      <w:pPr>
-        <w:spacing w:after="120" w:before="0" w:line="360"/>
-      </w:pPr>
-      <w:r>
-        <w:t xml:space="preserve">Implications. AJCC 8th edition staging is supported by these data: gross ETE is a reproducibly higher-risk feature than microscopic ETE in a large modern dataset. Microscopic ETE in tumors &gt;4 cm appears to carry incremental risk (path-proven recurrence 5.6%) and warrants individualized risk discussion, although the absolute event rate remains modest. Recurrence ascertainment in retrospective thyroid-cancer cohorts should follow a strict dual-track convention separating pathology-proven from imaging-only events, and lymphovascular-invasion modeling should keep lymphatic and vascular components distinct.</w:t>
+        <w:t xml:space="preserve">Comparison with prior literature. Our findings align with the systematic review of 80 studies (Elicit, 2026) summary that mETE’s prognostic value is context-dependent, and with the size-stratified findings of Chae A Kim and colleagues (2025), who reported recurrent/persistent disease rates of 2.6% (≤1 cm), 5.6% (1.1–2 cm), 16.7% (2.1–4 cm), and 8.2% (&gt;4 cm) in mETE patients[13]. Our cohort shows a similar size-dependent gradient for microscopic ETE primary path-proven recurrence (1.7%, 3.5%, 3.3%, 6.7% across the same bins), although the absolute rates are lower, consistent with our pathology-proven endpoint definition. The finding that all 1,266 gross ETE patients map to T3b under AJCC 8 reproduces the mechanism by which the AJCC 8 change drives substantial downstaging in cohorts with abundant microscopic ETE, as previously reported by Parvathareddy and colleagues (58.8% downstaging of T3 patients) and by Tran and colleagues (70.5% downstaging in a 577-patient cohort).[1, 2]</w:t>
+      </w:r>
+    </w:p>
+    <w:p>
+      <w:pPr>
+        <w:spacing w:after="120" w:before="0" w:line="360"/>
+      </w:pPr>
+      <w:r>
+        <w:t xml:space="preserve">Limitations. This is a retrospective single-institution cohort with substantial follow-up censoring (33.9% of patients have zero follow-up), 0.0% missing surgery-date indicator (</w:t>
+      </w:r>
+      <w:r>
+        <w:rPr>
+          <w:rFonts w:ascii="Courier New" w:cs="Courier New" w:eastAsia="Courier New" w:hAnsi="Courier New"/>
+          <w:sz w:val="20"/>
+          <w:szCs w:val="20"/>
+        </w:rPr>
+        <w:t xml:space="preserve">surg_date_missing</w:t>
+      </w:r>
+      <w:r>
+        <w:t xml:space="preserve">; n=0/4128), and free-text data-quality variability in the lymphatic-invasion field. The path-proven recurrence endpoint depends on completeness of pathology and operative-event capture; under-ascertainment is plausible particularly for patients whose recurrence was managed at outside institutions. The legacy </w:t>
+      </w:r>
+      <w:r>
+        <w:rPr>
+          <w:rFonts w:ascii="Courier New" w:cs="Courier New" w:eastAsia="Courier New" w:hAnsi="Courier New"/>
+          <w:sz w:val="20"/>
+          <w:szCs w:val="20"/>
+        </w:rPr>
+        <w:t xml:space="preserve">structural_recurrence_flag</w:t>
+      </w:r>
+      <w:r>
+        <w:t xml:space="preserve"> on </w:t>
+      </w:r>
+      <w:r>
+        <w:rPr>
+          <w:rFonts w:ascii="Courier New" w:cs="Courier New" w:eastAsia="Courier New" w:hAnsi="Courier New"/>
+          <w:sz w:val="20"/>
+          <w:szCs w:val="20"/>
+        </w:rPr>
+        <w:t xml:space="preserve">canonical_patient_master</w:t>
+      </w:r>
+      <w:r>
+        <w:t xml:space="preserve"> (headline M044-cohort counts in </w:t>
+      </w:r>
+      <w:r>
+        <w:rPr>
+          <w:rFonts w:ascii="Courier New" w:cs="Courier New" w:eastAsia="Courier New" w:hAnsi="Courier New"/>
+          <w:sz w:val="20"/>
+          <w:szCs w:val="20"/>
+        </w:rPr>
+        <w:t xml:space="preserve">manuscript_workspace.m044_legacy_recurrence_flag_audit_v1</w:t>
+      </w:r>
+      <w:r>
+        <w:t xml:space="preserve">) is inconsistent with the canonical dual-track resolution and was not used as a primary endpoint; its high apparent rate is an artifact and should not be over-interpreted. Multivariable adjustment cannot fully account for the systematic differences between the no/negative ETE subgroup and the rest of the cohort, and we therefore present that subgroup descriptively rather than as a direct biologic comparator. Surgery-flag calendar strata in this analytic extract: 1999‑01‑01–2024‑12‑31 n=4090, pre‑1999 n=3, post‑2024 n=35 (counts from mig_258 </w:t>
+      </w:r>
+      <w:r>
+        <w:rPr>
+          <w:rFonts w:ascii="Courier New" w:cs="Courier New" w:eastAsia="Courier New" w:hAnsi="Courier New"/>
+          <w:sz w:val="20"/>
+          <w:szCs w:val="20"/>
+        </w:rPr>
+        <w:t xml:space="preserve">surg_date_*</w:t>
+      </w:r>
+      <w:r>
+        <w:t xml:space="preserve">; not a censorship rule for the primary Cox slice). Era-stratified sensitivity analyses are reported in the supplement.</w:t>
+      </w:r>
+    </w:p>
+    <w:p>
+      <w:pPr>
+        <w:spacing w:after="120" w:before="0" w:line="360"/>
+      </w:pPr>
+      <w:r>
+        <w:t xml:space="preserve">Implications. AJCC 8th edition staging is supported by these data: gross ETE is a reproducibly higher-risk feature than microscopic ETE in a large modern dataset. Microscopic ETE in tumors &gt;4 cm appears to carry incremental risk (primary path-proven recurrence 6.7%) and warrants individualized risk discussion, although the absolute event rate remains modest. Recurrence ascertainment in retrospective thyroid-cancer cohorts should follow a strict dual-track convention separating pathology-proven from imaging-only events, and lymphovascular-invasion modeling should keep lymphatic and vascular components distinct.</w:t>
       </w:r>
     </w:p>
     <w:p>
@@ -1845,6 +2191,21 @@
           <w:bCs/>
         </w:rPr>
         <w:t xml:space="preserve">Figure 6.</w:t>
+      </w:r>
+      <w:r>
+        <w:t xml:space="preserve"> Kaplan–Meier path-proven recurrence-free survival by ETE group.</w:t>
+      </w:r>
+    </w:p>
+    <w:p>
+      <w:pPr>
+        <w:spacing w:after="120" w:before="0" w:line="360"/>
+      </w:pPr>
+      <w:r>
+        <w:rPr>
+          <w:b/>
+          <w:bCs/>
+        </w:rPr>
+        <w:t xml:space="preserve">Figure 7.</w:t>
       </w:r>
       <w:r>
         <w:t xml:space="preserve"> No/negative ETE subgroup explanatory panel.</w:t>

</xml_diff>